<commit_message>
Add only-dependencies field for fast demos, fix stale UI cache
</commit_message>
<xml_diff>
--- a/docs/RepoMedic_Technical_Approach.docx
+++ b/docs/RepoMedic_Technical_Approach.docx
@@ -7547,13 +7547,160 @@
         <w:t xml:space="preserve">&gt;=7.6.0</w:t>
       </w:r>
       <w:r>
-        <w:t xml:space="preserve">. Its verification was still running when</w:t>
-      </w:r>
-      <w:r>
-        <w:t xml:space="preserve"> </w:t>
-      </w:r>
-      <w:r>
-        <w:t xml:space="preserve">this document was written.</w:t>
+        <w:t xml:space="preserve"> </w:t>
+      </w:r>
+      <w:r>
+        <w:t xml:space="preserve">(44 min 40 s in total). Verdicts:</w:t>
+      </w:r>
+    </w:p>
+    <w:p>
+      <w:pPr>
+        <w:pStyle w:val="Compact"/>
+        <w:numPr>
+          <w:ilvl w:val="0"/>
+          <w:numId w:val="1007"/>
+        </w:numPr>
+      </w:pPr>
+      <w:r>
+        <w:rPr>
+          <w:b/>
+          <w:bCs/>
+        </w:rPr>
+        <w:t xml:space="preserve">chardet: failed.</w:t>
+      </w:r>
+      <w:r>
+        <w:t xml:space="preserve"> </w:t>
+      </w:r>
+      <w:r>
+        <w:t xml:space="preserve">Replay found the cp1252 difference. Gemma’s fix loop rewrote the code</w:t>
+      </w:r>
+      <w:r>
+        <w:t xml:space="preserve"> </w:t>
+      </w:r>
+      <w:r>
+        <w:t xml:space="preserve">twice using the replay evidence and got closer (</w:t>
+      </w:r>
+      <w:r>
+        <w:rPr>
+          <w:rStyle w:val="VerbatimChar"/>
+        </w:rPr>
+        <w:t xml:space="preserve">ISO-8859-1</w:t>
+      </w:r>
+      <w:r>
+        <w:t xml:space="preserve"> </w:t>
+      </w:r>
+      <w:r>
+        <w:t xml:space="preserve">→</w:t>
+      </w:r>
+      <w:r>
+        <w:t xml:space="preserve"> </w:t>
+      </w:r>
+      <w:r>
+        <w:rPr>
+          <w:rStyle w:val="VerbatimChar"/>
+        </w:rPr>
+        <w:t xml:space="preserve">iso-8859-1</w:t>
+      </w:r>
+      <w:r>
+        <w:t xml:space="preserve">), but the value</w:t>
+      </w:r>
+      <w:r>
+        <w:t xml:space="preserve"> </w:t>
+      </w:r>
+      <w:r>
+        <w:t xml:space="preserve">still differs, so it stays failed.</w:t>
+      </w:r>
+    </w:p>
+    <w:p>
+      <w:pPr>
+        <w:pStyle w:val="Compact"/>
+        <w:numPr>
+          <w:ilvl w:val="0"/>
+          <w:numId w:val="1007"/>
+        </w:numPr>
+      </w:pPr>
+      <w:r>
+        <w:rPr>
+          <w:b/>
+          <w:bCs/>
+        </w:rPr>
+        <w:t xml:space="preserve">toml → tomli: incomplete.</w:t>
+      </w:r>
+      <w:r>
+        <w:t xml:space="preserve"> </w:t>
+      </w:r>
+      <w:r>
+        <w:t xml:space="preserve">Attempt 0 failed; after Gemma’s fix, 1 recorded call replays</w:t>
+      </w:r>
+      <w:r>
+        <w:t xml:space="preserve"> </w:t>
+      </w:r>
+      <w:r>
+        <w:t xml:space="preserve">identically and tests pass, but the required behaviour probes could not run.</w:t>
+      </w:r>
+    </w:p>
+    <w:p>
+      <w:pPr>
+        <w:pStyle w:val="Compact"/>
+        <w:numPr>
+          <w:ilvl w:val="0"/>
+          <w:numId w:val="1007"/>
+        </w:numPr>
+      </w:pPr>
+      <w:r>
+        <w:rPr>
+          <w:b/>
+          <w:bCs/>
+        </w:rPr>
+        <w:t xml:space="preserve">appdirs → platformdirs: incomplete.</w:t>
+      </w:r>
+      <w:r>
+        <w:t xml:space="preserve"> </w:t>
+      </w:r>
+      <w:r>
+        <w:t xml:space="preserve">Its only recorded call was not replayable.</w:t>
+      </w:r>
+    </w:p>
+    <w:p>
+      <w:pPr>
+        <w:pStyle w:val="Compact"/>
+        <w:numPr>
+          <w:ilvl w:val="0"/>
+          <w:numId w:val="1007"/>
+        </w:numPr>
+      </w:pPr>
+      <w:r>
+        <w:rPr>
+          <w:b/>
+          <w:bCs/>
+        </w:rPr>
+        <w:t xml:space="preserve">setuptools: incomplete.</w:t>
+      </w:r>
+      <w:r>
+        <w:t xml:space="preserve"> </w:t>
+      </w:r>
+      <w:r>
+        <w:t xml:space="preserve">The code was rewritten, but no recorded call and no valid probe</w:t>
+      </w:r>
+      <w:r>
+        <w:t xml:space="preserve"> </w:t>
+      </w:r>
+      <w:r>
+        <w:t xml:space="preserve">exists to prove behaviour.</w:t>
+      </w:r>
+    </w:p>
+    <w:p>
+      <w:pPr>
+        <w:pStyle w:val="FirstParagraph"/>
+      </w:pPr>
+      <w:r>
+        <w:t xml:space="preserve">None of these was reported as verified, which is the intended behaviour when the evidence</w:t>
+      </w:r>
+      <w:r>
+        <w:t xml:space="preserve"> </w:t>
+      </w:r>
+      <w:r>
+        <w:t xml:space="preserve">is missing or contradicts the migration.</w:t>
       </w:r>
     </w:p>
     <w:bookmarkEnd w:id="29"/>
@@ -8776,6 +8923,9 @@
     </w:lvlOverride>
   </w:num>
   <w:num w:numId="1006">
+    <w:abstractNumId w:val="991"/>
+  </w:num>
+  <w:num w:numId="1007">
     <w:abstractNumId w:val="991"/>
   </w:num>
 </w:numbering>

</xml_diff>